<commit_message>
Marked as final and Digitally signed
</commit_message>
<xml_diff>
--- a/docs/Dashboard_Prompt_Playbook_Public.docx
+++ b/docs/Dashboard_Prompt_Playbook_Public.docx
@@ -4851,4 +4851,169 @@
     </w:rPr>
   </w:style>
 </w:styles>
+</file>
+
+<file path=_xmlsignatures/sig1.xml><?xml version="1.0" encoding="utf-8"?>
+<Signature xmlns="http://www.w3.org/2000/09/xmldsig#" Id="idPackageSignature">
+  <SignedInfo>
+    <CanonicalizationMethod Algorithm="http://www.w3.org/TR/2001/REC-xml-c14n-20010315"/>
+    <SignatureMethod Algorithm="http://www.w3.org/2001/04/xmldsig-more#ecdsa-sha384"/>
+    <Reference Type="http://www.w3.org/2000/09/xmldsig#Object" URI="#idPackageObject">
+      <DigestMethod Algorithm="http://www.w3.org/2001/04/xmldsig-more#sha384"/>
+      <DigestValue>hvd20NXaSEzpP0CcgFa61tuQ2BrOXBOwxb2lK9X9l7SNDdMcT1Vyp+QeUxt2GWu3</DigestValue>
+    </Reference>
+    <Reference Type="http://www.w3.org/2000/09/xmldsig#Object" URI="#idOfficeObject">
+      <DigestMethod Algorithm="http://www.w3.org/2001/04/xmldsig-more#sha384"/>
+      <DigestValue>ORcsTLKsx8LxZq1FMwEVW+QjMiBfiBt5W9EinNcL+oxUWAHi/Epc+paZ0+XlkjeG</DigestValue>
+    </Reference>
+    <Reference Type="http://uri.etsi.org/01903#SignedProperties" URI="#idSignedProperties">
+      <Transforms>
+        <Transform Algorithm="http://www.w3.org/TR/2001/REC-xml-c14n-20010315"/>
+      </Transforms>
+      <DigestMethod Algorithm="http://www.w3.org/2001/04/xmldsig-more#sha384"/>
+      <DigestValue>urn2S5atjd1/9QL3XGDQZxLbHiPhgi3UjUKo4e7Tk/OD8gJR01WfJcVzwzyAQ6Wv</DigestValue>
+    </Reference>
+  </SignedInfo>
+  <SignatureValue>s2SdxosIrVql5RIE6g6i1D4ZMFBJZ0GtxzWUfQWxigSgklfIWqD6l44Sil5YbK94kmME3Dk9KJm9
+wpF4Vdiw8VwFM6bsSCmqM+jfc3J1QvL2f/QbQlTwO6lGQk69PfCz</SignatureValue>
+  <KeyInfo>
+    <X509Data>
+      <X509Certificate>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</X509Certificate>
+    </X509Data>
+  </KeyInfo>
+  <Object Id="idPackageObject">
+    <Manifest>
+      <Reference URI="/_rels/.rels?ContentType=application/vnd.openxmlformats-package.relationships+xml">
+        <Transforms>
+          <Transform Algorithm="http://schemas.openxmlformats.org/package/2006/RelationshipTransform">
+            <mdssi:RelationshipReference xmlns:mdssi="http://schemas.openxmlformats.org/package/2006/digital-signature" SourceId="rId1"/>
+          </Transform>
+          <Transform Algorithm="http://www.w3.org/TR/2001/REC-xml-c14n-20010315"/>
+        </Transforms>
+        <DigestMethod Algorithm="http://www.w3.org/2001/04/xmldsig-more#sha384"/>
+        <DigestValue>Ijn7jL791h9aVGBZtzY0vbuJ8o6LeoglYH5iFYBcXJp4wG6LOyCBHb1QmkMaPj0S</DigestValue>
+      </Reference>
+      <Reference URI="/word/_rels/document.xml.rels?ContentType=application/vnd.openxmlformats-package.relationships+xml">
+        <Transforms>
+          <Transform Algorithm="http://schemas.openxmlformats.org/package/2006/RelationshipTransform">
+            <mdssi:RelationshipReference xmlns:mdssi="http://schemas.openxmlformats.org/package/2006/digital-signature" SourceId="rId3"/>
+            <mdssi:RelationshipReference xmlns:mdssi="http://schemas.openxmlformats.org/package/2006/digital-signature" SourceId="rId7"/>
+            <mdssi:RelationshipReference xmlns:mdssi="http://schemas.openxmlformats.org/package/2006/digital-signature" SourceId="rId2"/>
+            <mdssi:RelationshipReference xmlns:mdssi="http://schemas.openxmlformats.org/package/2006/digital-signature" SourceId="rId1"/>
+            <mdssi:RelationshipReference xmlns:mdssi="http://schemas.openxmlformats.org/package/2006/digital-signature" SourceId="rId6"/>
+            <mdssi:RelationshipReference xmlns:mdssi="http://schemas.openxmlformats.org/package/2006/digital-signature" SourceId="rId5"/>
+            <mdssi:RelationshipReference xmlns:mdssi="http://schemas.openxmlformats.org/package/2006/digital-signature" SourceId="rId4"/>
+            <mdssi:RelationshipReference xmlns:mdssi="http://schemas.openxmlformats.org/package/2006/digital-signature" SourceId="rId8"/>
+          </Transform>
+          <Transform Algorithm="http://www.w3.org/TR/2001/REC-xml-c14n-20010315"/>
+        </Transforms>
+        <DigestMethod Algorithm="http://www.w3.org/2001/04/xmldsig-more#sha384"/>
+        <DigestValue>A1lxOO4iHYb0dHf4BQZLeEpTWOzxANdNnfxP8CH/OUOHhIxapGdSSLCgac5X9GmS</DigestValue>
+      </Reference>
+      <Reference URI="/word/comments.xml?ContentType=application/vnd.openxmlformats-officedocument.wordprocessingml.comments+xml">
+        <DigestMethod Algorithm="http://www.w3.org/2001/04/xmldsig-more#sha384"/>
+        <DigestValue>LD+R0GsR4mMO8O4F88Bm9UV9EPyLDAXmGwLTdKPh2EfM6waG8QRanayktfwOSZVo</DigestValue>
+      </Reference>
+      <Reference URI="/word/document.xml?ContentType=application/vnd.openxmlformats-officedocument.wordprocessingml.document.main+xml">
+        <DigestMethod Algorithm="http://www.w3.org/2001/04/xmldsig-more#sha384"/>
+        <DigestValue>fWgTCUpZAh+y39Q980mOpNPDP55AB0LcaJsFb/d+0xdqnF3LCM2lG2CfthlAZsF+</DigestValue>
+      </Reference>
+      <Reference URI="/word/endnotes.xml?ContentType=application/vnd.openxmlformats-officedocument.wordprocessingml.endnotes+xml">
+        <DigestMethod Algorithm="http://www.w3.org/2001/04/xmldsig-more#sha384"/>
+        <DigestValue>ndfA9XAjj5GC9tb4mNEuDSkBLNTG1RrzdFt8SwBeb2vcBYjFqe4enZPV4lyV3c7l</DigestValue>
+      </Reference>
+      <Reference URI="/word/fontTable.xml?ContentType=application/vnd.openxmlformats-officedocument.wordprocessingml.fontTable+xml">
+        <DigestMethod Algorithm="http://www.w3.org/2001/04/xmldsig-more#sha384"/>
+        <DigestValue>iD5MPvc1rYkgTV0e4zs8/U/dClIqAS19PTnWTLSPTAlW+jUL8ghetT2VZhO9jQsB</DigestValue>
+      </Reference>
+      <Reference URI="/word/footer1.xml?ContentType=application/vnd.openxmlformats-officedocument.wordprocessingml.footer+xml">
+        <DigestMethod Algorithm="http://www.w3.org/2001/04/xmldsig-more#sha384"/>
+        <DigestValue>hanx/F7N25NKmi1BKAyqgBMNh8d3r3kZfl3PNP3cjno7oKnioX+HEesLFw+DbTaa</DigestValue>
+      </Reference>
+      <Reference URI="/word/footnotes.xml?ContentType=application/vnd.openxmlformats-officedocument.wordprocessingml.footnotes+xml">
+        <DigestMethod Algorithm="http://www.w3.org/2001/04/xmldsig-more#sha384"/>
+        <DigestValue>Gwozp34DxJknRnF9yLddlb5/2MyGsDt9V9LUKQkEXYR/oEO0vBmhQSvUXrO6/HeT</DigestValue>
+      </Reference>
+      <Reference URI="/word/numbering.xml?ContentType=application/vnd.openxmlformats-officedocument.wordprocessingml.numbering+xml">
+        <DigestMethod Algorithm="http://www.w3.org/2001/04/xmldsig-more#sha384"/>
+        <DigestValue>oZcu2r28WkUeDyRpJIAPcJXNh9lNQdLjeYNcmschxfrui7ee4hp1c0pTPbWBphsV</DigestValue>
+      </Reference>
+      <Reference URI="/word/settings.xml?ContentType=application/vnd.openxmlformats-officedocument.wordprocessingml.settings+xml">
+        <DigestMethod Algorithm="http://www.w3.org/2001/04/xmldsig-more#sha384"/>
+        <DigestValue>i3oaHFRWA7/N4oCPtvTlnV+8dtxIjfkN4ojHGt1mW7qQiduCo1BVWDa8WOQD5GBX</DigestValue>
+      </Reference>
+      <Reference URI="/word/styles.xml?ContentType=application/vnd.openxmlformats-officedocument.wordprocessingml.styles+xml">
+        <DigestMethod Algorithm="http://www.w3.org/2001/04/xmldsig-more#sha384"/>
+        <DigestValue>jZTiUIhp5Y6Ia1Fs31yxgqGFt7/wP54UkwlRsDrpFyFCY2jkaM8pjwbTasbRE3eD</DigestValue>
+      </Reference>
+    </Manifest>
+    <SignatureProperties>
+      <SignatureProperty Id="idSignatureTime" Target="#idPackageSignature">
+        <mdssi:SignatureTime xmlns:mdssi="http://schemas.openxmlformats.org/package/2006/digital-signature">
+          <mdssi:Format>YYYY-MM-DDThh:mm:ssTZD</mdssi:Format>
+          <mdssi:Value>2026-08-29T16:49:52Z</mdssi:Value>
+        </mdssi:SignatureTime>
+      </SignatureProperty>
+    </SignatureProperties>
+  </Object>
+  <Object Id="idOfficeObject">
+    <SignatureProperties>
+      <SignatureProperty Id="idOfficeV1Details" Target="#idPackageSignature">
+        <SignatureInfoV1 xmlns="http://schemas.microsoft.com/office/2006/digsig">
+          <SetupID/>
+          <SignatureText/>
+          <SignatureImage/>
+          <SignatureComments>Submission for IBM review</SignatureComments>
+          <WindowsVersion>10.0</WindowsVersion>
+          <OfficeVersion>16.0.20326/27</OfficeVersion>
+          <ApplicationVersion>16.0.20326</ApplicationVersion>
+          <Monitors>1</Monitors>
+          <HorizontalResolution>1920</HorizontalResolution>
+          <VerticalResolution>1080</VerticalResolution>
+          <ColorDepth>32</ColorDepth>
+          <SignatureProviderId>{00000000-0000-0000-0000-000000000000}</SignatureProviderId>
+          <SignatureProviderUrl/>
+          <SignatureProviderDetails>9</SignatureProviderDetails>
+          <SignatureType>1</SignatureType>
+        </SignatureInfoV1>
+      </SignatureProperty>
+    </SignatureProperties>
+  </Object>
+  <Object>
+    <xd:QualifyingProperties xmlns:xd="http://uri.etsi.org/01903/v1.3.2#" Target="#idPackageSignature">
+      <xd:SignedProperties Id="idSignedProperties">
+        <xd:SignedSignatureProperties>
+          <xd:SigningTime>2026-08-29T16:49:52Z</xd:SigningTime>
+          <xd:SigningCertificate>
+            <xd:Cert>
+              <xd:CertDigest>
+                <DigestMethod Algorithm="http://www.w3.org/2001/04/xmldsig-more#sha384"/>
+                <DigestValue>AAGwLZ0Mju8BR7lCmJFzSejv/Gfu6+ToSzLGusuNTd9Nzga1YrQDdyDar9Vdx84e</DigestValue>
+              </xd:CertDigest>
+              <xd:IssuerSerial>
+                <X509IssuerName>CN=caa22cf1-c13f-437c-bafd-aa6392590931</X509IssuerName>
+                <X509SerialNumber>17818523955636312980</X509SerialNumber>
+              </xd:IssuerSerial>
+            </xd:Cert>
+          </xd:SigningCertificate>
+          <xd:SignaturePolicyIdentifier>
+            <xd:SignaturePolicyImplied/>
+          </xd:SignaturePolicyIdentifier>
+        </xd:SignedSignatureProperties>
+        <xd:SignedDataObjectProperties>
+          <xd:CommitmentTypeIndication>
+            <xd:CommitmentTypeId>
+              <xd:Identifier>http://uri.etsi.org/01903/v1.2.2#ProofOfOrigin</xd:Identifier>
+              <xd:Description>Created and approved this document</xd:Description>
+            </xd:CommitmentTypeId>
+            <xd:AllSignedDataObjects/>
+            <xd:CommitmentTypeQualifiers>
+              <xd:CommitmentTypeQualifier>Submission for IBM review</xd:CommitmentTypeQualifier>
+            </xd:CommitmentTypeQualifiers>
+          </xd:CommitmentTypeIndication>
+        </xd:SignedDataObjectProperties>
+      </xd:SignedProperties>
+    </xd:QualifyingProperties>
+  </Object>
+</Signature>
 </file>
</xml_diff>